<commit_message>
Restore Copilot app workshop option
</commit_message>
<xml_diff>
--- a/guides/Attendee Guide - 10 min talk 50 min handson.docx
+++ b/guides/Attendee Guide - 10 min talk 50 min handson.docx
@@ -412,7 +412,6 @@
       </w:pPr>
       <w:r>
         <w:rPr/>
-        <w:t>Use GitHub Codespaces for this workshop:</w:t>
       </w:r>
     </w:p>
     <w:bookmarkStart w:id="12" w:name="X1a852f919a097a5e08252d6fe40c4f02b9accc1"/>
@@ -804,6 +803,39 @@
     </w:p>
     <w:bookmarkEnd w:id="19"/>
     <w:bookmarkEnd w:id="20"/>
+    <w:p>
+      <w:pPr>
+        <w:pStyle w:val="Heading2"/>
+      </w:pPr>
+      <w:r>
+        <w:t>Option B - GitHub Copilot app (desktop)</w:t>
+      </w:r>
+    </w:p>
+    <w:p>
+      <w:r>
+        <w:t>Use this alternative if you prefer the GitHub Copilot app rather than a Codespace.</w:t>
+      </w:r>
+    </w:p>
+    <w:p>
+      <w:r>
+        <w:t>1. Install the GitHub Copilot app from gh.io/app, Git, and Azure CLI. Data-track attendees also install Python.</w:t>
+      </w:r>
+    </w:p>
+    <w:p>
+      <w:r>
+        <w:t>2. Open the app, sign in with the GitHub account that has Copilot access, then add https://github.com/marinfrankovic/copilot-workshop-samples.git as a project using Add project from &gt; Repository URL.</w:t>
+      </w:r>
+    </w:p>
+    <w:p>
+      <w:r>
+        <w:t>3. Start an Interactive session on the workshop project. Ask Copilot to sign you into Azure, switch to your assigned subscription, and show the selected account.</w:t>
+      </w:r>
+    </w:p>
+    <w:p>
+      <w:r>
+        <w:t>In the labs, enter each quoted prompt in your Interactive session. Read and approve each proposed action before Copilot runs it.</w:t>
+      </w:r>
+    </w:p>
     <w:sectPr>
       <w:footnotePr>
         <w:numRestart w:val="eachSect"/>

</xml_diff>

<commit_message>
Clarify Windows Copilot app workshop path
</commit_message>
<xml_diff>
--- a/guides/Attendee Guide - 10 min talk 50 min handson.docx
+++ b/guides/Attendee Guide - 10 min talk 50 min handson.docx
@@ -808,7 +808,7 @@
         <w:pStyle w:val="Heading2"/>
       </w:pPr>
       <w:r>
-        <w:t>Option B - GitHub Copilot app (desktop)</w:t>
+        <w:t>Option B - GitHub Copilot app for Windows</w:t>
       </w:r>
     </w:p>
     <w:p>
@@ -818,7 +818,7 @@
     </w:p>
     <w:p>
       <w:r>
-        <w:t>1. Install the GitHub Copilot app from gh.io/app, Git, and Azure CLI. Data-track attendees also install Python.</w:t>
+        <w:t>1. Download the GitHub Copilot app for Windows (x64) from gh.io/copilot-app-win64, then install Git and Azure CLI. Data-track attendees also install Python.</w:t>
       </w:r>
     </w:p>
     <w:p>

</xml_diff>